<commit_message>
docs: update report (HDFS connector, requirements check, contribution sheet) and add capstone presentation
Co-Authored-By: Claude Sonnet 5.5 <noreply@anthropic.com>
Claude-Session: https://claude.ai/code/session_011bLLZbc7JqTvkfdxFXy8W1
</commit_message>
<xml_diff>
--- a/docs/Credit_Card_Fraud_Detection_Big_Data_Project.docx
+++ b/docs/Credit_Card_Fraud_Detection_Big_Data_Project.docx
@@ -262,7 +262,7 @@
               <w:br/>
               <w:t>EXECUTED: every number in Sections 10 to 13 was produced by running the supplied Hive-style SQL (via Spark SQL) and the PySpark pipeline on the full 1M rows in Spark local mode (2 cores). Timings are from that run.</w:t>
               <w:br/>
-              <w:t>NOT EXECUTED HERE: the HDFS, Hive, YARN, HBase and Pig commands are written and ready but need your Docker Compose environment. Run them and paste your own screenshots into the evidence placeholders; the trainer will ask you to demonstrate them live.</w:t>
+              <w:t>NOT EXECUTED HERE: the HDFS, Hive, YARN, HBase and Pig commands are written and ready but need your Docker Compose environment. Run them and paste your own screenshots into the evidence placeholders; the trainer will ask you to demonstrate them live. The connector script spark/hdfs_connect.py (Section 9.1) was tested end to end against a local file system standing in for HDFS, not against real HDFS containers.</w:t>
             </w:r>
           </w:p>
         </w:tc>
@@ -4223,6 +4223,546 @@
                 <w:sz w:val="19"/>
               </w:rPr>
               <w:t>[ Screenshot 1: hdfs dfs -ls -h /data/fraud/raw/ ]    [ Screenshot 2: hdfs fsck block report ]    [ Screenshot 3: NameNode UI file browser ]</w:t>
+            </w:r>
+          </w:p>
+        </w:tc>
+      </w:tr>
+    </w:tbl>
+    <w:p>
+      <w:pPr>
+        <w:spacing w:after="40"/>
+      </w:pPr>
+    </w:p>
+    <w:p>
+      <w:pPr>
+        <w:pStyle w:val="Heading2"/>
+      </w:pPr>
+      <w:r>
+        <w:t>9.1 Connecting from Docker with spark/hdfs_connect.py</w:t>
+      </w:r>
+    </w:p>
+    <w:p>
+      <w:r>
+        <w:rPr>
+          <w:b w:val="0"/>
+          <w:i w:val="0"/>
+        </w:rPr>
+        <w:t>One Python script performs the whole ingestion from inside the Docker network: it connects to the NameNode, creates the three HDFS folders, uploads the CSV, lists and measures the files, reads the data back, and can then run the full analysis against HDFS. Run it in a container that shares the compose network (for example spark-master), so the host name namenode resolves.</w:t>
+      </w:r>
+    </w:p>
+    <w:tbl>
+      <w:tblPr>
+        <w:tblW w:type="auto" w:w="0"/>
+        <w:tblLook w:firstColumn="1" w:firstRow="1" w:lastColumn="0" w:lastRow="0" w:noHBand="0" w:noVBand="1" w:val="04A0"/>
+        <w:tblBorders>
+          <w:top w:val="single" w:sz="4" w:color="D5DBE3"/>
+          <w:left w:val="single" w:sz="4" w:color="D5DBE3"/>
+          <w:bottom w:val="single" w:sz="4" w:color="D5DBE3"/>
+          <w:right w:val="single" w:sz="4" w:color="D5DBE3"/>
+          <w:insideH w:val="single" w:sz="4" w:color="D5DBE3"/>
+          <w:insideV w:val="single" w:sz="4" w:color="D5DBE3"/>
+        </w:tblBorders>
+      </w:tblPr>
+      <w:tblGrid>
+        <w:gridCol w:w="9638"/>
+      </w:tblGrid>
+      <w:tr>
+        <w:tc>
+          <w:tcPr>
+            <w:tcW w:type="dxa" w:w="9638"/>
+            <w:shd w:val="clear" w:color="auto" w:fill="F5F7FA"/>
+          </w:tcPr>
+          <w:p>
+            <w:pPr>
+              <w:spacing w:after="0" w:line="240" w:lineRule="auto"/>
+            </w:pPr>
+            <w:r/>
+            <w:r>
+              <w:rPr>
+                <w:rFonts w:ascii="Consolas" w:hAnsi="Consolas" w:eastAsia="Consolas"/>
+                <w:sz w:val="16"/>
+              </w:rPr>
+              <w:t>docker cp spark/. spark-master:/opt/fraud/</w:t>
+            </w:r>
+          </w:p>
+          <w:p>
+            <w:pPr>
+              <w:spacing w:after="0" w:line="240" w:lineRule="auto"/>
+            </w:pPr>
+            <w:r>
+              <w:rPr>
+                <w:rFonts w:ascii="Consolas" w:hAnsi="Consolas" w:eastAsia="Consolas"/>
+                <w:sz w:val="16"/>
+              </w:rPr>
+              <w:t>docker cp transactions.csv spark-master:/tmp/transactions.csv</w:t>
+            </w:r>
+          </w:p>
+          <w:p>
+            <w:pPr>
+              <w:spacing w:after="0" w:line="240" w:lineRule="auto"/>
+            </w:pPr>
+            <w:r>
+              <w:rPr>
+                <w:rFonts w:ascii="Consolas" w:hAnsi="Consolas" w:eastAsia="Consolas"/>
+                <w:sz w:val="16"/>
+              </w:rPr>
+              <w:t>docker exec -it spark-master spark-submit --master spark://spark-master:7077 \</w:t>
+            </w:r>
+          </w:p>
+          <w:p>
+            <w:pPr>
+              <w:spacing w:after="0" w:line="240" w:lineRule="auto"/>
+            </w:pPr>
+            <w:r>
+              <w:rPr>
+                <w:rFonts w:ascii="Consolas" w:hAnsi="Consolas" w:eastAsia="Consolas"/>
+                <w:sz w:val="16"/>
+              </w:rPr>
+              <w:t xml:space="preserve">    /opt/fraud/hdfs_connect.py --local-csv /tmp/transactions.csv --run-analysis</w:t>
+            </w:r>
+          </w:p>
+          <w:p>
+            <w:pPr>
+              <w:spacing w:after="0" w:line="240" w:lineRule="auto"/>
+            </w:pPr>
+            <w:r>
+              <w:rPr>
+                <w:rFonts w:ascii="Consolas" w:hAnsi="Consolas" w:eastAsia="Consolas"/>
+                <w:sz w:val="16"/>
+              </w:rPr>
+              <w:t xml:space="preserve"> </w:t>
+            </w:r>
+          </w:p>
+          <w:p>
+            <w:pPr>
+              <w:spacing w:after="0" w:line="240" w:lineRule="auto"/>
+            </w:pPr>
+            <w:r>
+              <w:rPr>
+                <w:rFonts w:ascii="Consolas" w:hAnsi="Consolas" w:eastAsia="Consolas"/>
+                <w:sz w:val="16"/>
+              </w:rPr>
+              <w:t># connection test only</w:t>
+            </w:r>
+          </w:p>
+          <w:p>
+            <w:pPr>
+              <w:spacing w:after="0" w:line="240" w:lineRule="auto"/>
+            </w:pPr>
+            <w:r>
+              <w:rPr>
+                <w:rFonts w:ascii="Consolas" w:hAnsi="Consolas" w:eastAsia="Consolas"/>
+                <w:sz w:val="16"/>
+              </w:rPr>
+              <w:t>docker exec -it spark-master spark-submit /opt/fraud/hdfs_connect.py --check-only</w:t>
+            </w:r>
+          </w:p>
+        </w:tc>
+      </w:tr>
+    </w:tbl>
+    <w:p>
+      <w:pPr>
+        <w:spacing w:after="40"/>
+      </w:pPr>
+    </w:p>
+    <w:tbl>
+      <w:tblPr>
+        <w:tblW w:type="auto" w:w="0"/>
+        <w:jc w:val="center"/>
+        <w:tblLayout w:type="fixed"/>
+        <w:tblLook w:firstColumn="1" w:firstRow="1" w:lastColumn="0" w:lastRow="0" w:noHBand="0" w:noVBand="1" w:val="04A0"/>
+        <w:tblBorders>
+          <w:top w:val="single" w:sz="4" w:color="BFC9D4"/>
+          <w:left w:val="single" w:sz="4" w:color="BFC9D4"/>
+          <w:bottom w:val="single" w:sz="4" w:color="BFC9D4"/>
+          <w:right w:val="single" w:sz="4" w:color="BFC9D4"/>
+          <w:insideH w:val="single" w:sz="4" w:color="BFC9D4"/>
+          <w:insideV w:val="single" w:sz="4" w:color="BFC9D4"/>
+        </w:tblBorders>
+      </w:tblPr>
+      <w:tblGrid>
+        <w:gridCol w:w="2948"/>
+        <w:gridCol w:w="2608"/>
+        <w:gridCol w:w="4082"/>
+      </w:tblGrid>
+      <w:tr>
+        <w:trPr>
+          <w:tblHeader w:val="true"/>
+        </w:trPr>
+        <w:tc>
+          <w:tcPr>
+            <w:tcW w:type="dxa" w:w="2948"/>
+            <w:shd w:val="clear" w:color="auto" w:fill="1F3A5F"/>
+          </w:tcPr>
+          <w:p>
+            <w:pPr>
+              <w:spacing w:after="20"/>
+            </w:pPr>
+            <w:r/>
+            <w:r>
+              <w:rPr>
+                <w:b/>
+                <w:color w:val="FFFFFF"/>
+                <w:sz w:val="17"/>
+              </w:rPr>
+              <w:t>Flag</w:t>
+            </w:r>
+          </w:p>
+        </w:tc>
+        <w:tc>
+          <w:tcPr>
+            <w:tcW w:type="dxa" w:w="2608"/>
+            <w:shd w:val="clear" w:color="auto" w:fill="1F3A5F"/>
+          </w:tcPr>
+          <w:p>
+            <w:pPr>
+              <w:spacing w:after="20"/>
+            </w:pPr>
+            <w:r/>
+            <w:r>
+              <w:rPr>
+                <w:b/>
+                <w:color w:val="FFFFFF"/>
+                <w:sz w:val="17"/>
+              </w:rPr>
+              <w:t>Default</w:t>
+            </w:r>
+          </w:p>
+        </w:tc>
+        <w:tc>
+          <w:tcPr>
+            <w:tcW w:type="dxa" w:w="4082"/>
+            <w:shd w:val="clear" w:color="auto" w:fill="1F3A5F"/>
+          </w:tcPr>
+          <w:p>
+            <w:pPr>
+              <w:spacing w:after="20"/>
+            </w:pPr>
+            <w:r/>
+            <w:r>
+              <w:rPr>
+                <w:b/>
+                <w:color w:val="FFFFFF"/>
+                <w:sz w:val="17"/>
+              </w:rPr>
+              <w:t>Purpose</w:t>
+            </w:r>
+          </w:p>
+        </w:tc>
+      </w:tr>
+      <w:tr>
+        <w:tc>
+          <w:tcPr>
+            <w:tcW w:type="dxa" w:w="2948"/>
+          </w:tcPr>
+          <w:p>
+            <w:pPr>
+              <w:spacing w:after="20"/>
+            </w:pPr>
+            <w:r/>
+            <w:r>
+              <w:rPr>
+                <w:sz w:val="17"/>
+              </w:rPr>
+              <w:t>--hdfs-uri</w:t>
+            </w:r>
+          </w:p>
+        </w:tc>
+        <w:tc>
+          <w:tcPr>
+            <w:tcW w:type="dxa" w:w="2608"/>
+          </w:tcPr>
+          <w:p>
+            <w:pPr>
+              <w:spacing w:after="20"/>
+            </w:pPr>
+            <w:r/>
+            <w:r>
+              <w:rPr>
+                <w:sz w:val="17"/>
+              </w:rPr>
+              <w:t>hdfs://namenode:8020</w:t>
+            </w:r>
+          </w:p>
+        </w:tc>
+        <w:tc>
+          <w:tcPr>
+            <w:tcW w:type="dxa" w:w="4082"/>
+          </w:tcPr>
+          <w:p>
+            <w:pPr>
+              <w:spacing w:after="20"/>
+            </w:pPr>
+            <w:r/>
+            <w:r>
+              <w:rPr>
+                <w:sz w:val="17"/>
+              </w:rPr>
+              <w:t>NameNode address (service name from the compose file)</w:t>
+            </w:r>
+          </w:p>
+        </w:tc>
+      </w:tr>
+      <w:tr>
+        <w:tc>
+          <w:tcPr>
+            <w:tcW w:type="dxa" w:w="2948"/>
+            <w:shd w:val="clear" w:color="auto" w:fill="F3F6FA"/>
+          </w:tcPr>
+          <w:p>
+            <w:pPr>
+              <w:spacing w:after="20"/>
+            </w:pPr>
+            <w:r/>
+            <w:r>
+              <w:rPr>
+                <w:sz w:val="17"/>
+              </w:rPr>
+              <w:t>--base</w:t>
+            </w:r>
+          </w:p>
+        </w:tc>
+        <w:tc>
+          <w:tcPr>
+            <w:tcW w:type="dxa" w:w="2608"/>
+            <w:shd w:val="clear" w:color="auto" w:fill="F3F6FA"/>
+          </w:tcPr>
+          <w:p>
+            <w:pPr>
+              <w:spacing w:after="20"/>
+            </w:pPr>
+            <w:r/>
+            <w:r>
+              <w:rPr>
+                <w:sz w:val="17"/>
+              </w:rPr>
+              <w:t>/data/fraud</w:t>
+            </w:r>
+          </w:p>
+        </w:tc>
+        <w:tc>
+          <w:tcPr>
+            <w:tcW w:type="dxa" w:w="4082"/>
+            <w:shd w:val="clear" w:color="auto" w:fill="F3F6FA"/>
+          </w:tcPr>
+          <w:p>
+            <w:pPr>
+              <w:spacing w:after="20"/>
+            </w:pPr>
+            <w:r/>
+            <w:r>
+              <w:rPr>
+                <w:sz w:val="17"/>
+              </w:rPr>
+              <w:t>Root HDFS folder (raw, processed, results)</w:t>
+            </w:r>
+          </w:p>
+        </w:tc>
+      </w:tr>
+      <w:tr>
+        <w:tc>
+          <w:tcPr>
+            <w:tcW w:type="dxa" w:w="2948"/>
+          </w:tcPr>
+          <w:p>
+            <w:pPr>
+              <w:spacing w:after="20"/>
+            </w:pPr>
+            <w:r/>
+            <w:r>
+              <w:rPr>
+                <w:sz w:val="17"/>
+              </w:rPr>
+              <w:t>--master</w:t>
+            </w:r>
+          </w:p>
+        </w:tc>
+        <w:tc>
+          <w:tcPr>
+            <w:tcW w:type="dxa" w:w="2608"/>
+          </w:tcPr>
+          <w:p>
+            <w:pPr>
+              <w:spacing w:after="20"/>
+            </w:pPr>
+            <w:r/>
+            <w:r>
+              <w:rPr>
+                <w:sz w:val="17"/>
+              </w:rPr>
+              <w:t>from spark-submit, else local[2]</w:t>
+            </w:r>
+          </w:p>
+        </w:tc>
+        <w:tc>
+          <w:tcPr>
+            <w:tcW w:type="dxa" w:w="4082"/>
+          </w:tcPr>
+          <w:p>
+            <w:pPr>
+              <w:spacing w:after="20"/>
+            </w:pPr>
+            <w:r/>
+            <w:r>
+              <w:rPr>
+                <w:sz w:val="17"/>
+              </w:rPr>
+              <w:t>yarn or spark://spark-master:7077</w:t>
+            </w:r>
+          </w:p>
+        </w:tc>
+      </w:tr>
+      <w:tr>
+        <w:tc>
+          <w:tcPr>
+            <w:tcW w:type="dxa" w:w="2948"/>
+            <w:shd w:val="clear" w:color="auto" w:fill="F3F6FA"/>
+          </w:tcPr>
+          <w:p>
+            <w:pPr>
+              <w:spacing w:after="20"/>
+            </w:pPr>
+            <w:r/>
+            <w:r>
+              <w:rPr>
+                <w:sz w:val="17"/>
+              </w:rPr>
+              <w:t>--local-csv</w:t>
+            </w:r>
+          </w:p>
+        </w:tc>
+        <w:tc>
+          <w:tcPr>
+            <w:tcW w:type="dxa" w:w="2608"/>
+            <w:shd w:val="clear" w:color="auto" w:fill="F3F6FA"/>
+          </w:tcPr>
+          <w:p>
+            <w:pPr>
+              <w:spacing w:after="20"/>
+            </w:pPr>
+            <w:r/>
+            <w:r>
+              <w:rPr>
+                <w:sz w:val="17"/>
+              </w:rPr>
+              <w:t>none</w:t>
+            </w:r>
+          </w:p>
+        </w:tc>
+        <w:tc>
+          <w:tcPr>
+            <w:tcW w:type="dxa" w:w="4082"/>
+            <w:shd w:val="clear" w:color="auto" w:fill="F3F6FA"/>
+          </w:tcPr>
+          <w:p>
+            <w:pPr>
+              <w:spacing w:after="20"/>
+            </w:pPr>
+            <w:r/>
+            <w:r>
+              <w:rPr>
+                <w:sz w:val="17"/>
+              </w:rPr>
+              <w:t>Local file to upload to &lt;base&gt;/raw/transactions.csv</w:t>
+            </w:r>
+          </w:p>
+        </w:tc>
+      </w:tr>
+      <w:tr>
+        <w:tc>
+          <w:tcPr>
+            <w:tcW w:type="dxa" w:w="2948"/>
+          </w:tcPr>
+          <w:p>
+            <w:pPr>
+              <w:spacing w:after="20"/>
+            </w:pPr>
+            <w:r/>
+            <w:r>
+              <w:rPr>
+                <w:sz w:val="17"/>
+              </w:rPr>
+              <w:t>--overwrite / --check-only / --run-analysis</w:t>
+            </w:r>
+          </w:p>
+        </w:tc>
+        <w:tc>
+          <w:tcPr>
+            <w:tcW w:type="dxa" w:w="2608"/>
+          </w:tcPr>
+          <w:p>
+            <w:pPr>
+              <w:spacing w:after="20"/>
+            </w:pPr>
+            <w:r/>
+            <w:r>
+              <w:rPr>
+                <w:sz w:val="17"/>
+              </w:rPr>
+              <w:t>off</w:t>
+            </w:r>
+          </w:p>
+        </w:tc>
+        <w:tc>
+          <w:tcPr>
+            <w:tcW w:type="dxa" w:w="4082"/>
+          </w:tcPr>
+          <w:p>
+            <w:pPr>
+              <w:spacing w:after="20"/>
+            </w:pPr>
+            <w:r/>
+            <w:r>
+              <w:rPr>
+                <w:sz w:val="17"/>
+              </w:rPr>
+              <w:t>Replace file / test connection only / run the analysis on HDFS data</w:t>
+            </w:r>
+          </w:p>
+        </w:tc>
+      </w:tr>
+    </w:tbl>
+    <w:p>
+      <w:pPr>
+        <w:spacing w:after="40"/>
+      </w:pPr>
+    </w:p>
+    <w:tbl>
+      <w:tblPr>
+        <w:tblW w:type="auto" w:w="0"/>
+        <w:tblLook w:firstColumn="1" w:firstRow="1" w:lastColumn="0" w:lastRow="0" w:noHBand="0" w:noVBand="1" w:val="04A0"/>
+      </w:tblPr>
+      <w:tblGrid>
+        <w:gridCol w:w="9638"/>
+      </w:tblGrid>
+      <w:tr>
+        <w:tc>
+          <w:tcPr>
+            <w:tcW w:type="dxa" w:w="9638"/>
+            <w:shd w:val="clear" w:color="auto" w:fill="FFF4E0"/>
+            <w:tcBorders>
+              <w:left w:val="single" w:sz="24" w:color="D98E04"/>
+            </w:tcBorders>
+          </w:tcPr>
+          <w:p>
+            <w:r/>
+            <w:r>
+              <w:rPr>
+                <w:b/>
+                <w:sz w:val="20"/>
+              </w:rPr>
+              <w:t>What was tested</w:t>
+            </w:r>
+          </w:p>
+          <w:p>
+            <w:pPr>
+              <w:spacing w:after="40"/>
+            </w:pPr>
+            <w:r>
+              <w:rPr>
+                <w:sz w:val="19"/>
+              </w:rPr>
+              <w:t>The script was run end to end on 150,000 generated rows against a local file system standing in for HDFS (same Hadoop client calls: connect, mkdirs, upload, list, read back, analysis, results written to the results folder, Parquet written to the processed folder). It has not been run against your NameNode. If a step fails, the usual causes are the wrong service name or port (check docker ps and the compose file) or running it outside the compose network.</w:t>
             </w:r>
           </w:p>
         </w:tc>
@@ -16845,7 +17385,7 @@
                 <w:rFonts w:ascii="Consolas" w:hAnsi="Consolas" w:eastAsia="Consolas"/>
                 <w:sz w:val="16"/>
               </w:rPr>
-              <w:t>|-- spark/fraud_analysis.py  run_sql_queries.py  make_charts.py</w:t>
+              <w:t>|-- spark/hdfs_connect.py  fraud_analysis.py  run_sql_queries.py  make_charts.py</w:t>
             </w:r>
           </w:p>
           <w:p>
@@ -17844,6 +18384,80 @@
                 <w:sz w:val="18"/>
               </w:rPr>
               <w:t>Wrote HiveQL-compatible SQL, ran the same statements via Spark SQL, and flagged that Beeline output must be re-checked</w:t>
+            </w:r>
+          </w:p>
+        </w:tc>
+      </w:tr>
+      <w:tr>
+        <w:tc>
+          <w:tcPr>
+            <w:tcW w:type="dxa" w:w="4252"/>
+            <w:shd w:val="clear" w:color="auto" w:fill="F3F6FA"/>
+          </w:tcPr>
+          <w:p>
+            <w:pPr>
+              <w:spacing w:after="20"/>
+            </w:pPr>
+            <w:r/>
+            <w:r>
+              <w:rPr>
+                <w:sz w:val="18"/>
+              </w:rPr>
+              <w:t>Hard-coded local master meant --master yarn was silently ignored; metrics were written with a local open() on an hdfs:// path; processed path contained '..'</w:t>
+            </w:r>
+          </w:p>
+        </w:tc>
+        <w:tc>
+          <w:tcPr>
+            <w:tcW w:type="dxa" w:w="5386"/>
+            <w:shd w:val="clear" w:color="auto" w:fill="F3F6FA"/>
+          </w:tcPr>
+          <w:p>
+            <w:pPr>
+              <w:spacing w:after="20"/>
+            </w:pPr>
+            <w:r/>
+            <w:r>
+              <w:rPr>
+                <w:sz w:val="18"/>
+              </w:rPr>
+              <w:t>Master now chosen by the launcher or SPARK_MASTER; metrics saved through Spark; processed path derived cleanly (found while writing hdfs_connect.py)</w:t>
+            </w:r>
+          </w:p>
+        </w:tc>
+      </w:tr>
+      <w:tr>
+        <w:tc>
+          <w:tcPr>
+            <w:tcW w:type="dxa" w:w="4252"/>
+          </w:tcPr>
+          <w:p>
+            <w:pPr>
+              <w:spacing w:after="20"/>
+            </w:pPr>
+            <w:r/>
+            <w:r>
+              <w:rPr>
+                <w:sz w:val="18"/>
+              </w:rPr>
+              <w:t>Reaching HDFS from outside the Docker network fails (DataNode host names do not resolve)</w:t>
+            </w:r>
+          </w:p>
+        </w:tc>
+        <w:tc>
+          <w:tcPr>
+            <w:tcW w:type="dxa" w:w="5386"/>
+          </w:tcPr>
+          <w:p>
+            <w:pPr>
+              <w:spacing w:after="20"/>
+            </w:pPr>
+            <w:r/>
+            <w:r>
+              <w:rPr>
+                <w:sz w:val="18"/>
+              </w:rPr>
+              <w:t>Run the connector inside a container on the compose network</w:t>
             </w:r>
           </w:p>
         </w:tc>
@@ -18119,7 +18733,769 @@
         <w:pStyle w:val="Heading1"/>
       </w:pPr>
       <w:r>
-        <w:t>24. 100-Mark Evaluation Map</w:t>
+        <w:t>24. Minimum Technical Requirements Check</w:t>
+      </w:r>
+    </w:p>
+    <w:p>
+      <w:r>
+        <w:rPr>
+          <w:b w:val="0"/>
+          <w:i w:val="0"/>
+        </w:rPr>
+        <w:t>The student guide lists what every project must contain. Status shows what exists in this repository today and what you still have to produce in your own environment.</w:t>
+      </w:r>
+    </w:p>
+    <w:tbl>
+      <w:tblPr>
+        <w:tblW w:type="auto" w:w="0"/>
+        <w:jc w:val="center"/>
+        <w:tblLayout w:type="fixed"/>
+        <w:tblLook w:firstColumn="1" w:firstRow="1" w:lastColumn="0" w:lastRow="0" w:noHBand="0" w:noVBand="1" w:val="04A0"/>
+        <w:tblBorders>
+          <w:top w:val="single" w:sz="4" w:color="BFC9D4"/>
+          <w:left w:val="single" w:sz="4" w:color="BFC9D4"/>
+          <w:bottom w:val="single" w:sz="4" w:color="BFC9D4"/>
+          <w:right w:val="single" w:sz="4" w:color="BFC9D4"/>
+          <w:insideH w:val="single" w:sz="4" w:color="BFC9D4"/>
+          <w:insideV w:val="single" w:sz="4" w:color="BFC9D4"/>
+        </w:tblBorders>
+      </w:tblPr>
+      <w:tblGrid>
+        <w:gridCol w:w="3969"/>
+        <w:gridCol w:w="2835"/>
+        <w:gridCol w:w="2835"/>
+      </w:tblGrid>
+      <w:tr>
+        <w:trPr>
+          <w:tblHeader w:val="true"/>
+        </w:trPr>
+        <w:tc>
+          <w:tcPr>
+            <w:tcW w:type="dxa" w:w="3969"/>
+            <w:shd w:val="clear" w:color="auto" w:fill="1F3A5F"/>
+          </w:tcPr>
+          <w:p>
+            <w:pPr>
+              <w:spacing w:after="20"/>
+            </w:pPr>
+            <w:r/>
+            <w:r>
+              <w:rPr>
+                <w:b/>
+                <w:color w:val="FFFFFF"/>
+                <w:sz w:val="17"/>
+              </w:rPr>
+              <w:t>Requirement (Student Guide section 5)</w:t>
+            </w:r>
+          </w:p>
+        </w:tc>
+        <w:tc>
+          <w:tcPr>
+            <w:tcW w:type="dxa" w:w="2835"/>
+            <w:shd w:val="clear" w:color="auto" w:fill="1F3A5F"/>
+          </w:tcPr>
+          <w:p>
+            <w:pPr>
+              <w:spacing w:after="20"/>
+            </w:pPr>
+            <w:r/>
+            <w:r>
+              <w:rPr>
+                <w:b/>
+                <w:color w:val="FFFFFF"/>
+                <w:sz w:val="17"/>
+              </w:rPr>
+              <w:t>Where</w:t>
+            </w:r>
+          </w:p>
+        </w:tc>
+        <w:tc>
+          <w:tcPr>
+            <w:tcW w:type="dxa" w:w="2835"/>
+            <w:shd w:val="clear" w:color="auto" w:fill="1F3A5F"/>
+          </w:tcPr>
+          <w:p>
+            <w:pPr>
+              <w:spacing w:after="20"/>
+            </w:pPr>
+            <w:r/>
+            <w:r>
+              <w:rPr>
+                <w:b/>
+                <w:color w:val="FFFFFF"/>
+                <w:sz w:val="17"/>
+              </w:rPr>
+              <w:t>Status</w:t>
+            </w:r>
+          </w:p>
+        </w:tc>
+      </w:tr>
+      <w:tr>
+        <w:tc>
+          <w:tcPr>
+            <w:tcW w:type="dxa" w:w="3969"/>
+          </w:tcPr>
+          <w:p>
+            <w:pPr>
+              <w:spacing w:after="20"/>
+            </w:pPr>
+            <w:r/>
+            <w:r>
+              <w:rPr>
+                <w:sz w:val="17"/>
+              </w:rPr>
+              <w:t>Clear business problem and analytics objective</w:t>
+            </w:r>
+          </w:p>
+        </w:tc>
+        <w:tc>
+          <w:tcPr>
+            <w:tcW w:type="dxa" w:w="2835"/>
+          </w:tcPr>
+          <w:p>
+            <w:pPr>
+              <w:spacing w:after="20"/>
+            </w:pPr>
+            <w:r/>
+            <w:r>
+              <w:rPr>
+                <w:sz w:val="17"/>
+              </w:rPr>
+              <w:t>Sections 2 to 4</w:t>
+            </w:r>
+          </w:p>
+        </w:tc>
+        <w:tc>
+          <w:tcPr>
+            <w:tcW w:type="dxa" w:w="2835"/>
+          </w:tcPr>
+          <w:p>
+            <w:pPr>
+              <w:spacing w:after="20"/>
+            </w:pPr>
+            <w:r/>
+            <w:r>
+              <w:rPr>
+                <w:sz w:val="17"/>
+              </w:rPr>
+              <w:t>Done</w:t>
+            </w:r>
+          </w:p>
+        </w:tc>
+      </w:tr>
+      <w:tr>
+        <w:tc>
+          <w:tcPr>
+            <w:tcW w:type="dxa" w:w="3969"/>
+            <w:shd w:val="clear" w:color="auto" w:fill="F3F6FA"/>
+          </w:tcPr>
+          <w:p>
+            <w:pPr>
+              <w:spacing w:after="20"/>
+            </w:pPr>
+            <w:r/>
+            <w:r>
+              <w:rPr>
+                <w:sz w:val="17"/>
+              </w:rPr>
+              <w:t>Dataset description, source and important columns</w:t>
+            </w:r>
+          </w:p>
+        </w:tc>
+        <w:tc>
+          <w:tcPr>
+            <w:tcW w:type="dxa" w:w="2835"/>
+            <w:shd w:val="clear" w:color="auto" w:fill="F3F6FA"/>
+          </w:tcPr>
+          <w:p>
+            <w:pPr>
+              <w:spacing w:after="20"/>
+            </w:pPr>
+            <w:r/>
+            <w:r>
+              <w:rPr>
+                <w:sz w:val="17"/>
+              </w:rPr>
+              <w:t>Sections 5, 6; data/README.md</w:t>
+            </w:r>
+          </w:p>
+        </w:tc>
+        <w:tc>
+          <w:tcPr>
+            <w:tcW w:type="dxa" w:w="2835"/>
+            <w:shd w:val="clear" w:color="auto" w:fill="F3F6FA"/>
+          </w:tcPr>
+          <w:p>
+            <w:pPr>
+              <w:spacing w:after="20"/>
+            </w:pPr>
+            <w:r/>
+            <w:r>
+              <w:rPr>
+                <w:sz w:val="17"/>
+              </w:rPr>
+              <w:t>Done (synthetic data, stated clearly)</w:t>
+            </w:r>
+          </w:p>
+        </w:tc>
+      </w:tr>
+      <w:tr>
+        <w:tc>
+          <w:tcPr>
+            <w:tcW w:type="dxa" w:w="3969"/>
+          </w:tcPr>
+          <w:p>
+            <w:pPr>
+              <w:spacing w:after="20"/>
+            </w:pPr>
+            <w:r/>
+            <w:r>
+              <w:rPr>
+                <w:sz w:val="17"/>
+              </w:rPr>
+              <w:t>Dataset stored and managed through HDFS</w:t>
+            </w:r>
+          </w:p>
+        </w:tc>
+        <w:tc>
+          <w:tcPr>
+            <w:tcW w:type="dxa" w:w="2835"/>
+          </w:tcPr>
+          <w:p>
+            <w:pPr>
+              <w:spacing w:after="20"/>
+            </w:pPr>
+            <w:r/>
+            <w:r>
+              <w:rPr>
+                <w:sz w:val="17"/>
+              </w:rPr>
+              <w:t>Section 9, 9.1; hdfs/, spark/hdfs_connect.py</w:t>
+            </w:r>
+          </w:p>
+        </w:tc>
+        <w:tc>
+          <w:tcPr>
+            <w:tcW w:type="dxa" w:w="2835"/>
+          </w:tcPr>
+          <w:p>
+            <w:pPr>
+              <w:spacing w:after="20"/>
+            </w:pPr>
+            <w:r/>
+            <w:r>
+              <w:rPr>
+                <w:sz w:val="17"/>
+              </w:rPr>
+              <w:t>Scripts ready; you run them in Docker</w:t>
+            </w:r>
+          </w:p>
+        </w:tc>
+      </w:tr>
+      <w:tr>
+        <w:tc>
+          <w:tcPr>
+            <w:tcW w:type="dxa" w:w="3969"/>
+            <w:shd w:val="clear" w:color="auto" w:fill="F3F6FA"/>
+          </w:tcPr>
+          <w:p>
+            <w:pPr>
+              <w:spacing w:after="20"/>
+            </w:pPr>
+            <w:r/>
+            <w:r>
+              <w:rPr>
+                <w:sz w:val="17"/>
+              </w:rPr>
+              <w:t>Relevant HDFS commands demonstrated</w:t>
+            </w:r>
+          </w:p>
+        </w:tc>
+        <w:tc>
+          <w:tcPr>
+            <w:tcW w:type="dxa" w:w="2835"/>
+            <w:shd w:val="clear" w:color="auto" w:fill="F3F6FA"/>
+          </w:tcPr>
+          <w:p>
+            <w:pPr>
+              <w:spacing w:after="20"/>
+            </w:pPr>
+            <w:r/>
+            <w:r>
+              <w:rPr>
+                <w:sz w:val="17"/>
+              </w:rPr>
+              <w:t>Section 9; hdfs/hdfs_commands.txt</w:t>
+            </w:r>
+          </w:p>
+        </w:tc>
+        <w:tc>
+          <w:tcPr>
+            <w:tcW w:type="dxa" w:w="2835"/>
+            <w:shd w:val="clear" w:color="auto" w:fill="F3F6FA"/>
+          </w:tcPr>
+          <w:p>
+            <w:pPr>
+              <w:spacing w:after="20"/>
+            </w:pPr>
+            <w:r/>
+            <w:r>
+              <w:rPr>
+                <w:sz w:val="17"/>
+              </w:rPr>
+              <w:t>Ready; add screenshots</w:t>
+            </w:r>
+          </w:p>
+        </w:tc>
+      </w:tr>
+      <w:tr>
+        <w:tc>
+          <w:tcPr>
+            <w:tcW w:type="dxa" w:w="3969"/>
+          </w:tcPr>
+          <w:p>
+            <w:pPr>
+              <w:spacing w:after="20"/>
+            </w:pPr>
+            <w:r/>
+            <w:r>
+              <w:rPr>
+                <w:sz w:val="17"/>
+              </w:rPr>
+              <w:t>At least one Hive database/table and queries</w:t>
+            </w:r>
+          </w:p>
+        </w:tc>
+        <w:tc>
+          <w:tcPr>
+            <w:tcW w:type="dxa" w:w="2835"/>
+          </w:tcPr>
+          <w:p>
+            <w:pPr>
+              <w:spacing w:after="20"/>
+            </w:pPr>
+            <w:r/>
+            <w:r>
+              <w:rPr>
+                <w:sz w:val="17"/>
+              </w:rPr>
+              <w:t>Section 10; hive/</w:t>
+            </w:r>
+          </w:p>
+        </w:tc>
+        <w:tc>
+          <w:tcPr>
+            <w:tcW w:type="dxa" w:w="2835"/>
+          </w:tcPr>
+          <w:p>
+            <w:pPr>
+              <w:spacing w:after="20"/>
+            </w:pPr>
+            <w:r/>
+            <w:r>
+              <w:rPr>
+                <w:sz w:val="17"/>
+              </w:rPr>
+              <w:t>Written; results produced with Spark SQL; run in Beeline and compare</w:t>
+            </w:r>
+          </w:p>
+        </w:tc>
+      </w:tr>
+      <w:tr>
+        <w:tc>
+          <w:tcPr>
+            <w:tcW w:type="dxa" w:w="3969"/>
+            <w:shd w:val="clear" w:color="auto" w:fill="F3F6FA"/>
+          </w:tcPr>
+          <w:p>
+            <w:pPr>
+              <w:spacing w:after="20"/>
+            </w:pPr>
+            <w:r/>
+            <w:r>
+              <w:rPr>
+                <w:sz w:val="17"/>
+              </w:rPr>
+              <w:t>At least one Spark / PySpark workflow</w:t>
+            </w:r>
+          </w:p>
+        </w:tc>
+        <w:tc>
+          <w:tcPr>
+            <w:tcW w:type="dxa" w:w="2835"/>
+            <w:shd w:val="clear" w:color="auto" w:fill="F3F6FA"/>
+          </w:tcPr>
+          <w:p>
+            <w:pPr>
+              <w:spacing w:after="20"/>
+            </w:pPr>
+            <w:r/>
+            <w:r>
+              <w:rPr>
+                <w:sz w:val="17"/>
+              </w:rPr>
+              <w:t>Sections 11, 12</w:t>
+            </w:r>
+          </w:p>
+        </w:tc>
+        <w:tc>
+          <w:tcPr>
+            <w:tcW w:type="dxa" w:w="2835"/>
+            <w:shd w:val="clear" w:color="auto" w:fill="F3F6FA"/>
+          </w:tcPr>
+          <w:p>
+            <w:pPr>
+              <w:spacing w:after="20"/>
+            </w:pPr>
+            <w:r/>
+            <w:r>
+              <w:rPr>
+                <w:sz w:val="17"/>
+              </w:rPr>
+              <w:t>Executed on 1M rows (local mode)</w:t>
+            </w:r>
+          </w:p>
+        </w:tc>
+      </w:tr>
+      <w:tr>
+        <w:tc>
+          <w:tcPr>
+            <w:tcW w:type="dxa" w:w="3969"/>
+          </w:tcPr>
+          <w:p>
+            <w:pPr>
+              <w:spacing w:after="20"/>
+            </w:pPr>
+            <w:r/>
+            <w:r>
+              <w:rPr>
+                <w:sz w:val="17"/>
+              </w:rPr>
+              <w:t>Data cleaning, transformation and analytical results</w:t>
+            </w:r>
+          </w:p>
+        </w:tc>
+        <w:tc>
+          <w:tcPr>
+            <w:tcW w:type="dxa" w:w="2835"/>
+          </w:tcPr>
+          <w:p>
+            <w:pPr>
+              <w:spacing w:after="20"/>
+            </w:pPr>
+            <w:r/>
+            <w:r>
+              <w:rPr>
+                <w:sz w:val="17"/>
+              </w:rPr>
+              <w:t>Sections 11, 16</w:t>
+            </w:r>
+          </w:p>
+        </w:tc>
+        <w:tc>
+          <w:tcPr>
+            <w:tcW w:type="dxa" w:w="2835"/>
+          </w:tcPr>
+          <w:p>
+            <w:pPr>
+              <w:spacing w:after="20"/>
+            </w:pPr>
+            <w:r/>
+            <w:r>
+              <w:rPr>
+                <w:sz w:val="17"/>
+              </w:rPr>
+              <w:t>Executed</w:t>
+            </w:r>
+          </w:p>
+        </w:tc>
+      </w:tr>
+      <w:tr>
+        <w:tc>
+          <w:tcPr>
+            <w:tcW w:type="dxa" w:w="3969"/>
+            <w:shd w:val="clear" w:color="auto" w:fill="F3F6FA"/>
+          </w:tcPr>
+          <w:p>
+            <w:pPr>
+              <w:spacing w:after="20"/>
+            </w:pPr>
+            <w:r/>
+            <w:r>
+              <w:rPr>
+                <w:sz w:val="17"/>
+              </w:rPr>
+              <w:t>Evidence of distributed processing</w:t>
+            </w:r>
+          </w:p>
+        </w:tc>
+        <w:tc>
+          <w:tcPr>
+            <w:tcW w:type="dxa" w:w="2835"/>
+            <w:shd w:val="clear" w:color="auto" w:fill="F3F6FA"/>
+          </w:tcPr>
+          <w:p>
+            <w:pPr>
+              <w:spacing w:after="20"/>
+            </w:pPr>
+            <w:r/>
+            <w:r>
+              <w:rPr>
+                <w:sz w:val="17"/>
+              </w:rPr>
+              <w:t>Section 17</w:t>
+            </w:r>
+          </w:p>
+        </w:tc>
+        <w:tc>
+          <w:tcPr>
+            <w:tcW w:type="dxa" w:w="2835"/>
+            <w:shd w:val="clear" w:color="auto" w:fill="F3F6FA"/>
+          </w:tcPr>
+          <w:p>
+            <w:pPr>
+              <w:spacing w:after="20"/>
+            </w:pPr>
+            <w:r/>
+            <w:r>
+              <w:rPr>
+                <w:sz w:val="17"/>
+              </w:rPr>
+              <w:t>Partly: local mode only; add Spark UI and YARN screenshots from the cluster run</w:t>
+            </w:r>
+          </w:p>
+        </w:tc>
+      </w:tr>
+      <w:tr>
+        <w:tc>
+          <w:tcPr>
+            <w:tcW w:type="dxa" w:w="3969"/>
+          </w:tcPr>
+          <w:p>
+            <w:pPr>
+              <w:spacing w:after="20"/>
+            </w:pPr>
+            <w:r/>
+            <w:r>
+              <w:rPr>
+                <w:sz w:val="17"/>
+              </w:rPr>
+              <w:t>HBase or Pig evidence</w:t>
+            </w:r>
+          </w:p>
+        </w:tc>
+        <w:tc>
+          <w:tcPr>
+            <w:tcW w:type="dxa" w:w="2835"/>
+          </w:tcPr>
+          <w:p>
+            <w:pPr>
+              <w:spacing w:after="20"/>
+            </w:pPr>
+            <w:r/>
+            <w:r>
+              <w:rPr>
+                <w:sz w:val="17"/>
+              </w:rPr>
+              <w:t>Section 14; hbase/, pig/</w:t>
+            </w:r>
+          </w:p>
+        </w:tc>
+        <w:tc>
+          <w:tcPr>
+            <w:tcW w:type="dxa" w:w="2835"/>
+          </w:tcPr>
+          <w:p>
+            <w:pPr>
+              <w:spacing w:after="20"/>
+            </w:pPr>
+            <w:r/>
+            <w:r>
+              <w:rPr>
+                <w:sz w:val="17"/>
+              </w:rPr>
+              <w:t>Scripts ready; run and add screenshots</w:t>
+            </w:r>
+          </w:p>
+        </w:tc>
+      </w:tr>
+      <w:tr>
+        <w:tc>
+          <w:tcPr>
+            <w:tcW w:type="dxa" w:w="3969"/>
+            <w:shd w:val="clear" w:color="auto" w:fill="F3F6FA"/>
+          </w:tcPr>
+          <w:p>
+            <w:pPr>
+              <w:spacing w:after="20"/>
+            </w:pPr>
+            <w:r/>
+            <w:r>
+              <w:rPr>
+                <w:sz w:val="17"/>
+              </w:rPr>
+              <w:t>Git/GitHub repository with meaningful commits</w:t>
+            </w:r>
+          </w:p>
+        </w:tc>
+        <w:tc>
+          <w:tcPr>
+            <w:tcW w:type="dxa" w:w="2835"/>
+            <w:shd w:val="clear" w:color="auto" w:fill="F3F6FA"/>
+          </w:tcPr>
+          <w:p>
+            <w:pPr>
+              <w:spacing w:after="20"/>
+            </w:pPr>
+            <w:r/>
+            <w:r>
+              <w:rPr>
+                <w:sz w:val="17"/>
+              </w:rPr>
+              <w:t>Section 18</w:t>
+            </w:r>
+          </w:p>
+        </w:tc>
+        <w:tc>
+          <w:tcPr>
+            <w:tcW w:type="dxa" w:w="2835"/>
+            <w:shd w:val="clear" w:color="auto" w:fill="F3F6FA"/>
+          </w:tcPr>
+          <w:p>
+            <w:pPr>
+              <w:spacing w:after="20"/>
+            </w:pPr>
+            <w:r/>
+            <w:r>
+              <w:rPr>
+                <w:sz w:val="17"/>
+              </w:rPr>
+              <w:t>Repository prepared with 10 commits; you push it; teammates commit their own folders</w:t>
+            </w:r>
+          </w:p>
+        </w:tc>
+      </w:tr>
+      <w:tr>
+        <w:tc>
+          <w:tcPr>
+            <w:tcW w:type="dxa" w:w="3969"/>
+          </w:tcPr>
+          <w:p>
+            <w:pPr>
+              <w:spacing w:after="20"/>
+            </w:pPr>
+            <w:r/>
+            <w:r>
+              <w:rPr>
+                <w:sz w:val="17"/>
+              </w:rPr>
+              <w:t>README with setup, architecture, execution and results</w:t>
+            </w:r>
+          </w:p>
+        </w:tc>
+        <w:tc>
+          <w:tcPr>
+            <w:tcW w:type="dxa" w:w="2835"/>
+          </w:tcPr>
+          <w:p>
+            <w:pPr>
+              <w:spacing w:after="20"/>
+            </w:pPr>
+            <w:r/>
+            <w:r>
+              <w:rPr>
+                <w:sz w:val="17"/>
+              </w:rPr>
+              <w:t>README.md</w:t>
+            </w:r>
+          </w:p>
+        </w:tc>
+        <w:tc>
+          <w:tcPr>
+            <w:tcW w:type="dxa" w:w="2835"/>
+          </w:tcPr>
+          <w:p>
+            <w:pPr>
+              <w:spacing w:after="20"/>
+            </w:pPr>
+            <w:r/>
+            <w:r>
+              <w:rPr>
+                <w:sz w:val="17"/>
+              </w:rPr>
+              <w:t>Done</w:t>
+            </w:r>
+          </w:p>
+        </w:tc>
+      </w:tr>
+      <w:tr>
+        <w:tc>
+          <w:tcPr>
+            <w:tcW w:type="dxa" w:w="3969"/>
+            <w:shd w:val="clear" w:color="auto" w:fill="F3F6FA"/>
+          </w:tcPr>
+          <w:p>
+            <w:pPr>
+              <w:spacing w:after="20"/>
+            </w:pPr>
+            <w:r/>
+            <w:r>
+              <w:rPr>
+                <w:sz w:val="17"/>
+              </w:rPr>
+              <w:t>Final PPT and individual contribution sheet</w:t>
+            </w:r>
+          </w:p>
+        </w:tc>
+        <w:tc>
+          <w:tcPr>
+            <w:tcW w:type="dxa" w:w="2835"/>
+            <w:shd w:val="clear" w:color="auto" w:fill="F3F6FA"/>
+          </w:tcPr>
+          <w:p>
+            <w:pPr>
+              <w:spacing w:after="20"/>
+            </w:pPr>
+            <w:r/>
+            <w:r>
+              <w:rPr>
+                <w:sz w:val="17"/>
+              </w:rPr>
+              <w:t>Capstone deck (.pptx); Appendix A</w:t>
+            </w:r>
+          </w:p>
+        </w:tc>
+        <w:tc>
+          <w:tcPr>
+            <w:tcW w:type="dxa" w:w="2835"/>
+            <w:shd w:val="clear" w:color="auto" w:fill="F3F6FA"/>
+          </w:tcPr>
+          <w:p>
+            <w:pPr>
+              <w:spacing w:after="20"/>
+            </w:pPr>
+            <w:r/>
+            <w:r>
+              <w:rPr>
+                <w:sz w:val="17"/>
+              </w:rPr>
+              <w:t>Deck built; contribution sheet to fill in</w:t>
+            </w:r>
+          </w:p>
+        </w:tc>
+      </w:tr>
+    </w:tbl>
+    <w:p>
+      <w:pPr>
+        <w:spacing w:after="40"/>
+      </w:pPr>
+    </w:p>
+    <w:p>
+      <w:pPr>
+        <w:pStyle w:val="Heading1"/>
+      </w:pPr>
+      <w:r>
+        <w:t>25. 100-Mark Evaluation Map</w:t>
       </w:r>
     </w:p>
     <w:tbl>
@@ -18969,7 +20345,7 @@
         <w:pStyle w:val="Heading1"/>
       </w:pPr>
       <w:r>
-        <w:t>25. Final Submission Checklist</w:t>
+        <w:t>26. Final Submission Checklist</w:t>
       </w:r>
     </w:p>
     <w:tbl>
@@ -19512,6 +20888,1483 @@
                 <w:sz w:val="18"/>
               </w:rPr>
               <w:t>[ ]</w:t>
+            </w:r>
+          </w:p>
+        </w:tc>
+      </w:tr>
+    </w:tbl>
+    <w:p>
+      <w:pPr>
+        <w:spacing w:after="40"/>
+      </w:pPr>
+    </w:p>
+    <w:p>
+      <w:pPr>
+        <w:pStyle w:val="Heading1"/>
+      </w:pPr>
+      <w:r>
+        <w:t>Appendix A. Individual Contribution Sheet</w:t>
+      </w:r>
+    </w:p>
+    <w:p>
+      <w:r>
+        <w:rPr>
+          <w:b w:val="0"/>
+          <w:i w:val="0"/>
+        </w:rPr>
+        <w:t>Each student completes one block. The trainer may ask any student to open the code or commands listed here and explain them.</w:t>
+      </w:r>
+    </w:p>
+    <w:tbl>
+      <w:tblPr>
+        <w:tblW w:type="auto" w:w="0"/>
+        <w:jc w:val="center"/>
+        <w:tblLayout w:type="fixed"/>
+        <w:tblLook w:firstColumn="1" w:firstRow="1" w:lastColumn="0" w:lastRow="0" w:noHBand="0" w:noVBand="1" w:val="04A0"/>
+        <w:tblBorders>
+          <w:top w:val="single" w:sz="4" w:color="BFC9D4"/>
+          <w:left w:val="single" w:sz="4" w:color="BFC9D4"/>
+          <w:bottom w:val="single" w:sz="4" w:color="BFC9D4"/>
+          <w:right w:val="single" w:sz="4" w:color="BFC9D4"/>
+          <w:insideH w:val="single" w:sz="4" w:color="BFC9D4"/>
+          <w:insideV w:val="single" w:sz="4" w:color="BFC9D4"/>
+        </w:tblBorders>
+      </w:tblPr>
+      <w:tblGrid>
+        <w:gridCol w:w="3402"/>
+        <w:gridCol w:w="6236"/>
+      </w:tblGrid>
+      <w:tr>
+        <w:trPr>
+          <w:tblHeader w:val="true"/>
+        </w:trPr>
+        <w:tc>
+          <w:tcPr>
+            <w:tcW w:type="dxa" w:w="3402"/>
+            <w:shd w:val="clear" w:color="auto" w:fill="1F3A5F"/>
+          </w:tcPr>
+          <w:p>
+            <w:pPr>
+              <w:spacing w:after="20"/>
+            </w:pPr>
+            <w:r/>
+            <w:r>
+              <w:rPr>
+                <w:b/>
+                <w:color w:val="FFFFFF"/>
+                <w:sz w:val="17"/>
+              </w:rPr>
+              <w:t>Student 1: Data ingestion + HDFS</w:t>
+            </w:r>
+          </w:p>
+        </w:tc>
+        <w:tc>
+          <w:tcPr>
+            <w:tcW w:type="dxa" w:w="6236"/>
+            <w:shd w:val="clear" w:color="auto" w:fill="1F3A5F"/>
+          </w:tcPr>
+          <w:p>
+            <w:pPr>
+              <w:spacing w:after="20"/>
+            </w:pPr>
+            <w:r/>
+            <w:r>
+              <w:rPr>
+                <w:b/>
+                <w:color w:val="FFFFFF"/>
+                <w:sz w:val="17"/>
+              </w:rPr>
+            </w:r>
+          </w:p>
+        </w:tc>
+      </w:tr>
+      <w:tr>
+        <w:tc>
+          <w:tcPr>
+            <w:tcW w:type="dxa" w:w="3402"/>
+          </w:tcPr>
+          <w:p>
+            <w:pPr>
+              <w:spacing w:after="20"/>
+            </w:pPr>
+            <w:r/>
+            <w:r>
+              <w:rPr>
+                <w:b/>
+                <w:sz w:val="17"/>
+              </w:rPr>
+              <w:t>Name / roll number</w:t>
+            </w:r>
+          </w:p>
+        </w:tc>
+        <w:tc>
+          <w:tcPr>
+            <w:tcW w:type="dxa" w:w="6236"/>
+          </w:tcPr>
+          <w:p>
+            <w:pPr>
+              <w:spacing w:after="20"/>
+            </w:pPr>
+            <w:r/>
+            <w:r>
+              <w:rPr>
+                <w:sz w:val="17"/>
+              </w:rPr>
+            </w:r>
+          </w:p>
+        </w:tc>
+      </w:tr>
+      <w:tr>
+        <w:tc>
+          <w:tcPr>
+            <w:tcW w:type="dxa" w:w="3402"/>
+            <w:shd w:val="clear" w:color="auto" w:fill="F3F6FA"/>
+          </w:tcPr>
+          <w:p>
+            <w:pPr>
+              <w:spacing w:after="20"/>
+            </w:pPr>
+            <w:r/>
+            <w:r>
+              <w:rPr>
+                <w:b/>
+                <w:sz w:val="17"/>
+              </w:rPr>
+              <w:t>What I implemented</w:t>
+            </w:r>
+          </w:p>
+        </w:tc>
+        <w:tc>
+          <w:tcPr>
+            <w:tcW w:type="dxa" w:w="6236"/>
+            <w:shd w:val="clear" w:color="auto" w:fill="F3F6FA"/>
+          </w:tcPr>
+          <w:p>
+            <w:pPr>
+              <w:spacing w:after="20"/>
+            </w:pPr>
+            <w:r/>
+            <w:r>
+              <w:rPr>
+                <w:sz w:val="17"/>
+              </w:rPr>
+            </w:r>
+          </w:p>
+        </w:tc>
+      </w:tr>
+      <w:tr>
+        <w:tc>
+          <w:tcPr>
+            <w:tcW w:type="dxa" w:w="3402"/>
+          </w:tcPr>
+          <w:p>
+            <w:pPr>
+              <w:spacing w:after="20"/>
+            </w:pPr>
+            <w:r/>
+            <w:r>
+              <w:rPr>
+                <w:b/>
+                <w:sz w:val="17"/>
+              </w:rPr>
+              <w:t>Files and commits (links)</w:t>
+            </w:r>
+          </w:p>
+        </w:tc>
+        <w:tc>
+          <w:tcPr>
+            <w:tcW w:type="dxa" w:w="6236"/>
+          </w:tcPr>
+          <w:p>
+            <w:pPr>
+              <w:spacing w:after="20"/>
+            </w:pPr>
+            <w:r/>
+            <w:r>
+              <w:rPr>
+                <w:sz w:val="17"/>
+              </w:rPr>
+              <w:t xml:space="preserve">hdfs/, data/, spark/hdfs_connect.py  |  commits: </w:t>
+            </w:r>
+          </w:p>
+        </w:tc>
+      </w:tr>
+      <w:tr>
+        <w:tc>
+          <w:tcPr>
+            <w:tcW w:type="dxa" w:w="3402"/>
+            <w:shd w:val="clear" w:color="auto" w:fill="F3F6FA"/>
+          </w:tcPr>
+          <w:p>
+            <w:pPr>
+              <w:spacing w:after="20"/>
+            </w:pPr>
+            <w:r/>
+            <w:r>
+              <w:rPr>
+                <w:b/>
+                <w:sz w:val="17"/>
+              </w:rPr>
+              <w:t>Commands / code I can demonstrate</w:t>
+            </w:r>
+          </w:p>
+        </w:tc>
+        <w:tc>
+          <w:tcPr>
+            <w:tcW w:type="dxa" w:w="6236"/>
+            <w:shd w:val="clear" w:color="auto" w:fill="F3F6FA"/>
+          </w:tcPr>
+          <w:p>
+            <w:pPr>
+              <w:spacing w:after="20"/>
+            </w:pPr>
+            <w:r/>
+            <w:r>
+              <w:rPr>
+                <w:sz w:val="17"/>
+              </w:rPr>
+            </w:r>
+          </w:p>
+        </w:tc>
+      </w:tr>
+      <w:tr>
+        <w:tc>
+          <w:tcPr>
+            <w:tcW w:type="dxa" w:w="3402"/>
+          </w:tcPr>
+          <w:p>
+            <w:pPr>
+              <w:spacing w:after="20"/>
+            </w:pPr>
+            <w:r/>
+            <w:r>
+              <w:rPr>
+                <w:b/>
+                <w:sz w:val="17"/>
+              </w:rPr>
+              <w:t>Technical problem I faced and how I solved it</w:t>
+            </w:r>
+          </w:p>
+        </w:tc>
+        <w:tc>
+          <w:tcPr>
+            <w:tcW w:type="dxa" w:w="6236"/>
+          </w:tcPr>
+          <w:p>
+            <w:pPr>
+              <w:spacing w:after="20"/>
+            </w:pPr>
+            <w:r/>
+            <w:r>
+              <w:rPr>
+                <w:sz w:val="17"/>
+              </w:rPr>
+            </w:r>
+          </w:p>
+        </w:tc>
+      </w:tr>
+      <w:tr>
+        <w:tc>
+          <w:tcPr>
+            <w:tcW w:type="dxa" w:w="3402"/>
+            <w:shd w:val="clear" w:color="auto" w:fill="F3F6FA"/>
+          </w:tcPr>
+          <w:p>
+            <w:pPr>
+              <w:spacing w:after="20"/>
+            </w:pPr>
+            <w:r/>
+            <w:r>
+              <w:rPr>
+                <w:b/>
+                <w:sz w:val="17"/>
+              </w:rPr>
+              <w:t>Questions I can answer</w:t>
+            </w:r>
+          </w:p>
+        </w:tc>
+        <w:tc>
+          <w:tcPr>
+            <w:tcW w:type="dxa" w:w="6236"/>
+            <w:shd w:val="clear" w:color="auto" w:fill="F3F6FA"/>
+          </w:tcPr>
+          <w:p>
+            <w:pPr>
+              <w:spacing w:after="20"/>
+            </w:pPr>
+            <w:r/>
+            <w:r>
+              <w:rPr>
+                <w:sz w:val="17"/>
+              </w:rPr>
+            </w:r>
+          </w:p>
+        </w:tc>
+      </w:tr>
+    </w:tbl>
+    <w:p>
+      <w:pPr>
+        <w:spacing w:after="40"/>
+      </w:pPr>
+    </w:p>
+    <w:tbl>
+      <w:tblPr>
+        <w:tblW w:type="auto" w:w="0"/>
+        <w:jc w:val="center"/>
+        <w:tblLayout w:type="fixed"/>
+        <w:tblLook w:firstColumn="1" w:firstRow="1" w:lastColumn="0" w:lastRow="0" w:noHBand="0" w:noVBand="1" w:val="04A0"/>
+        <w:tblBorders>
+          <w:top w:val="single" w:sz="4" w:color="BFC9D4"/>
+          <w:left w:val="single" w:sz="4" w:color="BFC9D4"/>
+          <w:bottom w:val="single" w:sz="4" w:color="BFC9D4"/>
+          <w:right w:val="single" w:sz="4" w:color="BFC9D4"/>
+          <w:insideH w:val="single" w:sz="4" w:color="BFC9D4"/>
+          <w:insideV w:val="single" w:sz="4" w:color="BFC9D4"/>
+        </w:tblBorders>
+      </w:tblPr>
+      <w:tblGrid>
+        <w:gridCol w:w="3402"/>
+        <w:gridCol w:w="6236"/>
+      </w:tblGrid>
+      <w:tr>
+        <w:trPr>
+          <w:tblHeader w:val="true"/>
+        </w:trPr>
+        <w:tc>
+          <w:tcPr>
+            <w:tcW w:type="dxa" w:w="3402"/>
+            <w:shd w:val="clear" w:color="auto" w:fill="1F3A5F"/>
+          </w:tcPr>
+          <w:p>
+            <w:pPr>
+              <w:spacing w:after="20"/>
+            </w:pPr>
+            <w:r/>
+            <w:r>
+              <w:rPr>
+                <w:b/>
+                <w:color w:val="FFFFFF"/>
+                <w:sz w:val="17"/>
+              </w:rPr>
+              <w:t>Student 2: Hive + data modelling</w:t>
+            </w:r>
+          </w:p>
+        </w:tc>
+        <w:tc>
+          <w:tcPr>
+            <w:tcW w:type="dxa" w:w="6236"/>
+            <w:shd w:val="clear" w:color="auto" w:fill="1F3A5F"/>
+          </w:tcPr>
+          <w:p>
+            <w:pPr>
+              <w:spacing w:after="20"/>
+            </w:pPr>
+            <w:r/>
+            <w:r>
+              <w:rPr>
+                <w:b/>
+                <w:color w:val="FFFFFF"/>
+                <w:sz w:val="17"/>
+              </w:rPr>
+            </w:r>
+          </w:p>
+        </w:tc>
+      </w:tr>
+      <w:tr>
+        <w:tc>
+          <w:tcPr>
+            <w:tcW w:type="dxa" w:w="3402"/>
+          </w:tcPr>
+          <w:p>
+            <w:pPr>
+              <w:spacing w:after="20"/>
+            </w:pPr>
+            <w:r/>
+            <w:r>
+              <w:rPr>
+                <w:b/>
+                <w:sz w:val="17"/>
+              </w:rPr>
+              <w:t>Name / roll number</w:t>
+            </w:r>
+          </w:p>
+        </w:tc>
+        <w:tc>
+          <w:tcPr>
+            <w:tcW w:type="dxa" w:w="6236"/>
+          </w:tcPr>
+          <w:p>
+            <w:pPr>
+              <w:spacing w:after="20"/>
+            </w:pPr>
+            <w:r/>
+            <w:r>
+              <w:rPr>
+                <w:sz w:val="17"/>
+              </w:rPr>
+            </w:r>
+          </w:p>
+        </w:tc>
+      </w:tr>
+      <w:tr>
+        <w:tc>
+          <w:tcPr>
+            <w:tcW w:type="dxa" w:w="3402"/>
+            <w:shd w:val="clear" w:color="auto" w:fill="F3F6FA"/>
+          </w:tcPr>
+          <w:p>
+            <w:pPr>
+              <w:spacing w:after="20"/>
+            </w:pPr>
+            <w:r/>
+            <w:r>
+              <w:rPr>
+                <w:b/>
+                <w:sz w:val="17"/>
+              </w:rPr>
+              <w:t>What I implemented</w:t>
+            </w:r>
+          </w:p>
+        </w:tc>
+        <w:tc>
+          <w:tcPr>
+            <w:tcW w:type="dxa" w:w="6236"/>
+            <w:shd w:val="clear" w:color="auto" w:fill="F3F6FA"/>
+          </w:tcPr>
+          <w:p>
+            <w:pPr>
+              <w:spacing w:after="20"/>
+            </w:pPr>
+            <w:r/>
+            <w:r>
+              <w:rPr>
+                <w:sz w:val="17"/>
+              </w:rPr>
+            </w:r>
+          </w:p>
+        </w:tc>
+      </w:tr>
+      <w:tr>
+        <w:tc>
+          <w:tcPr>
+            <w:tcW w:type="dxa" w:w="3402"/>
+          </w:tcPr>
+          <w:p>
+            <w:pPr>
+              <w:spacing w:after="20"/>
+            </w:pPr>
+            <w:r/>
+            <w:r>
+              <w:rPr>
+                <w:b/>
+                <w:sz w:val="17"/>
+              </w:rPr>
+              <w:t>Files and commits (links)</w:t>
+            </w:r>
+          </w:p>
+        </w:tc>
+        <w:tc>
+          <w:tcPr>
+            <w:tcW w:type="dxa" w:w="6236"/>
+          </w:tcPr>
+          <w:p>
+            <w:pPr>
+              <w:spacing w:after="20"/>
+            </w:pPr>
+            <w:r/>
+            <w:r>
+              <w:rPr>
+                <w:sz w:val="17"/>
+              </w:rPr>
+              <w:t xml:space="preserve">hive/  |  commits: </w:t>
+            </w:r>
+          </w:p>
+        </w:tc>
+      </w:tr>
+      <w:tr>
+        <w:tc>
+          <w:tcPr>
+            <w:tcW w:type="dxa" w:w="3402"/>
+            <w:shd w:val="clear" w:color="auto" w:fill="F3F6FA"/>
+          </w:tcPr>
+          <w:p>
+            <w:pPr>
+              <w:spacing w:after="20"/>
+            </w:pPr>
+            <w:r/>
+            <w:r>
+              <w:rPr>
+                <w:b/>
+                <w:sz w:val="17"/>
+              </w:rPr>
+              <w:t>Commands / code I can demonstrate</w:t>
+            </w:r>
+          </w:p>
+        </w:tc>
+        <w:tc>
+          <w:tcPr>
+            <w:tcW w:type="dxa" w:w="6236"/>
+            <w:shd w:val="clear" w:color="auto" w:fill="F3F6FA"/>
+          </w:tcPr>
+          <w:p>
+            <w:pPr>
+              <w:spacing w:after="20"/>
+            </w:pPr>
+            <w:r/>
+            <w:r>
+              <w:rPr>
+                <w:sz w:val="17"/>
+              </w:rPr>
+            </w:r>
+          </w:p>
+        </w:tc>
+      </w:tr>
+      <w:tr>
+        <w:tc>
+          <w:tcPr>
+            <w:tcW w:type="dxa" w:w="3402"/>
+          </w:tcPr>
+          <w:p>
+            <w:pPr>
+              <w:spacing w:after="20"/>
+            </w:pPr>
+            <w:r/>
+            <w:r>
+              <w:rPr>
+                <w:b/>
+                <w:sz w:val="17"/>
+              </w:rPr>
+              <w:t>Technical problem I faced and how I solved it</w:t>
+            </w:r>
+          </w:p>
+        </w:tc>
+        <w:tc>
+          <w:tcPr>
+            <w:tcW w:type="dxa" w:w="6236"/>
+          </w:tcPr>
+          <w:p>
+            <w:pPr>
+              <w:spacing w:after="20"/>
+            </w:pPr>
+            <w:r/>
+            <w:r>
+              <w:rPr>
+                <w:sz w:val="17"/>
+              </w:rPr>
+            </w:r>
+          </w:p>
+        </w:tc>
+      </w:tr>
+      <w:tr>
+        <w:tc>
+          <w:tcPr>
+            <w:tcW w:type="dxa" w:w="3402"/>
+            <w:shd w:val="clear" w:color="auto" w:fill="F3F6FA"/>
+          </w:tcPr>
+          <w:p>
+            <w:pPr>
+              <w:spacing w:after="20"/>
+            </w:pPr>
+            <w:r/>
+            <w:r>
+              <w:rPr>
+                <w:b/>
+                <w:sz w:val="17"/>
+              </w:rPr>
+              <w:t>Questions I can answer</w:t>
+            </w:r>
+          </w:p>
+        </w:tc>
+        <w:tc>
+          <w:tcPr>
+            <w:tcW w:type="dxa" w:w="6236"/>
+            <w:shd w:val="clear" w:color="auto" w:fill="F3F6FA"/>
+          </w:tcPr>
+          <w:p>
+            <w:pPr>
+              <w:spacing w:after="20"/>
+            </w:pPr>
+            <w:r/>
+            <w:r>
+              <w:rPr>
+                <w:sz w:val="17"/>
+              </w:rPr>
+            </w:r>
+          </w:p>
+        </w:tc>
+      </w:tr>
+    </w:tbl>
+    <w:p>
+      <w:pPr>
+        <w:spacing w:after="40"/>
+      </w:pPr>
+    </w:p>
+    <w:tbl>
+      <w:tblPr>
+        <w:tblW w:type="auto" w:w="0"/>
+        <w:jc w:val="center"/>
+        <w:tblLayout w:type="fixed"/>
+        <w:tblLook w:firstColumn="1" w:firstRow="1" w:lastColumn="0" w:lastRow="0" w:noHBand="0" w:noVBand="1" w:val="04A0"/>
+        <w:tblBorders>
+          <w:top w:val="single" w:sz="4" w:color="BFC9D4"/>
+          <w:left w:val="single" w:sz="4" w:color="BFC9D4"/>
+          <w:bottom w:val="single" w:sz="4" w:color="BFC9D4"/>
+          <w:right w:val="single" w:sz="4" w:color="BFC9D4"/>
+          <w:insideH w:val="single" w:sz="4" w:color="BFC9D4"/>
+          <w:insideV w:val="single" w:sz="4" w:color="BFC9D4"/>
+        </w:tblBorders>
+      </w:tblPr>
+      <w:tblGrid>
+        <w:gridCol w:w="3402"/>
+        <w:gridCol w:w="6236"/>
+      </w:tblGrid>
+      <w:tr>
+        <w:trPr>
+          <w:tblHeader w:val="true"/>
+        </w:trPr>
+        <w:tc>
+          <w:tcPr>
+            <w:tcW w:type="dxa" w:w="3402"/>
+            <w:shd w:val="clear" w:color="auto" w:fill="1F3A5F"/>
+          </w:tcPr>
+          <w:p>
+            <w:pPr>
+              <w:spacing w:after="20"/>
+            </w:pPr>
+            <w:r/>
+            <w:r>
+              <w:rPr>
+                <w:b/>
+                <w:color w:val="FFFFFF"/>
+                <w:sz w:val="17"/>
+              </w:rPr>
+              <w:t>Student 3: Spark + PySpark</w:t>
+            </w:r>
+          </w:p>
+        </w:tc>
+        <w:tc>
+          <w:tcPr>
+            <w:tcW w:type="dxa" w:w="6236"/>
+            <w:shd w:val="clear" w:color="auto" w:fill="1F3A5F"/>
+          </w:tcPr>
+          <w:p>
+            <w:pPr>
+              <w:spacing w:after="20"/>
+            </w:pPr>
+            <w:r/>
+            <w:r>
+              <w:rPr>
+                <w:b/>
+                <w:color w:val="FFFFFF"/>
+                <w:sz w:val="17"/>
+              </w:rPr>
+            </w:r>
+          </w:p>
+        </w:tc>
+      </w:tr>
+      <w:tr>
+        <w:tc>
+          <w:tcPr>
+            <w:tcW w:type="dxa" w:w="3402"/>
+          </w:tcPr>
+          <w:p>
+            <w:pPr>
+              <w:spacing w:after="20"/>
+            </w:pPr>
+            <w:r/>
+            <w:r>
+              <w:rPr>
+                <w:b/>
+                <w:sz w:val="17"/>
+              </w:rPr>
+              <w:t>Name / roll number</w:t>
+            </w:r>
+          </w:p>
+        </w:tc>
+        <w:tc>
+          <w:tcPr>
+            <w:tcW w:type="dxa" w:w="6236"/>
+          </w:tcPr>
+          <w:p>
+            <w:pPr>
+              <w:spacing w:after="20"/>
+            </w:pPr>
+            <w:r/>
+            <w:r>
+              <w:rPr>
+                <w:sz w:val="17"/>
+              </w:rPr>
+            </w:r>
+          </w:p>
+        </w:tc>
+      </w:tr>
+      <w:tr>
+        <w:tc>
+          <w:tcPr>
+            <w:tcW w:type="dxa" w:w="3402"/>
+            <w:shd w:val="clear" w:color="auto" w:fill="F3F6FA"/>
+          </w:tcPr>
+          <w:p>
+            <w:pPr>
+              <w:spacing w:after="20"/>
+            </w:pPr>
+            <w:r/>
+            <w:r>
+              <w:rPr>
+                <w:b/>
+                <w:sz w:val="17"/>
+              </w:rPr>
+              <w:t>What I implemented</w:t>
+            </w:r>
+          </w:p>
+        </w:tc>
+        <w:tc>
+          <w:tcPr>
+            <w:tcW w:type="dxa" w:w="6236"/>
+            <w:shd w:val="clear" w:color="auto" w:fill="F3F6FA"/>
+          </w:tcPr>
+          <w:p>
+            <w:pPr>
+              <w:spacing w:after="20"/>
+            </w:pPr>
+            <w:r/>
+            <w:r>
+              <w:rPr>
+                <w:sz w:val="17"/>
+              </w:rPr>
+            </w:r>
+          </w:p>
+        </w:tc>
+      </w:tr>
+      <w:tr>
+        <w:tc>
+          <w:tcPr>
+            <w:tcW w:type="dxa" w:w="3402"/>
+          </w:tcPr>
+          <w:p>
+            <w:pPr>
+              <w:spacing w:after="20"/>
+            </w:pPr>
+            <w:r/>
+            <w:r>
+              <w:rPr>
+                <w:b/>
+                <w:sz w:val="17"/>
+              </w:rPr>
+              <w:t>Files and commits (links)</w:t>
+            </w:r>
+          </w:p>
+        </w:tc>
+        <w:tc>
+          <w:tcPr>
+            <w:tcW w:type="dxa" w:w="6236"/>
+          </w:tcPr>
+          <w:p>
+            <w:pPr>
+              <w:spacing w:after="20"/>
+            </w:pPr>
+            <w:r/>
+            <w:r>
+              <w:rPr>
+                <w:sz w:val="17"/>
+              </w:rPr>
+              <w:t xml:space="preserve">spark/fraud_analysis.py, notebook  |  commits: </w:t>
+            </w:r>
+          </w:p>
+        </w:tc>
+      </w:tr>
+      <w:tr>
+        <w:tc>
+          <w:tcPr>
+            <w:tcW w:type="dxa" w:w="3402"/>
+            <w:shd w:val="clear" w:color="auto" w:fill="F3F6FA"/>
+          </w:tcPr>
+          <w:p>
+            <w:pPr>
+              <w:spacing w:after="20"/>
+            </w:pPr>
+            <w:r/>
+            <w:r>
+              <w:rPr>
+                <w:b/>
+                <w:sz w:val="17"/>
+              </w:rPr>
+              <w:t>Commands / code I can demonstrate</w:t>
+            </w:r>
+          </w:p>
+        </w:tc>
+        <w:tc>
+          <w:tcPr>
+            <w:tcW w:type="dxa" w:w="6236"/>
+            <w:shd w:val="clear" w:color="auto" w:fill="F3F6FA"/>
+          </w:tcPr>
+          <w:p>
+            <w:pPr>
+              <w:spacing w:after="20"/>
+            </w:pPr>
+            <w:r/>
+            <w:r>
+              <w:rPr>
+                <w:sz w:val="17"/>
+              </w:rPr>
+            </w:r>
+          </w:p>
+        </w:tc>
+      </w:tr>
+      <w:tr>
+        <w:tc>
+          <w:tcPr>
+            <w:tcW w:type="dxa" w:w="3402"/>
+          </w:tcPr>
+          <w:p>
+            <w:pPr>
+              <w:spacing w:after="20"/>
+            </w:pPr>
+            <w:r/>
+            <w:r>
+              <w:rPr>
+                <w:b/>
+                <w:sz w:val="17"/>
+              </w:rPr>
+              <w:t>Technical problem I faced and how I solved it</w:t>
+            </w:r>
+          </w:p>
+        </w:tc>
+        <w:tc>
+          <w:tcPr>
+            <w:tcW w:type="dxa" w:w="6236"/>
+          </w:tcPr>
+          <w:p>
+            <w:pPr>
+              <w:spacing w:after="20"/>
+            </w:pPr>
+            <w:r/>
+            <w:r>
+              <w:rPr>
+                <w:sz w:val="17"/>
+              </w:rPr>
+            </w:r>
+          </w:p>
+        </w:tc>
+      </w:tr>
+      <w:tr>
+        <w:tc>
+          <w:tcPr>
+            <w:tcW w:type="dxa" w:w="3402"/>
+            <w:shd w:val="clear" w:color="auto" w:fill="F3F6FA"/>
+          </w:tcPr>
+          <w:p>
+            <w:pPr>
+              <w:spacing w:after="20"/>
+            </w:pPr>
+            <w:r/>
+            <w:r>
+              <w:rPr>
+                <w:b/>
+                <w:sz w:val="17"/>
+              </w:rPr>
+              <w:t>Questions I can answer</w:t>
+            </w:r>
+          </w:p>
+        </w:tc>
+        <w:tc>
+          <w:tcPr>
+            <w:tcW w:type="dxa" w:w="6236"/>
+            <w:shd w:val="clear" w:color="auto" w:fill="F3F6FA"/>
+          </w:tcPr>
+          <w:p>
+            <w:pPr>
+              <w:spacing w:after="20"/>
+            </w:pPr>
+            <w:r/>
+            <w:r>
+              <w:rPr>
+                <w:sz w:val="17"/>
+              </w:rPr>
+            </w:r>
+          </w:p>
+        </w:tc>
+      </w:tr>
+    </w:tbl>
+    <w:p>
+      <w:pPr>
+        <w:spacing w:after="40"/>
+      </w:pPr>
+    </w:p>
+    <w:tbl>
+      <w:tblPr>
+        <w:tblW w:type="auto" w:w="0"/>
+        <w:jc w:val="center"/>
+        <w:tblLayout w:type="fixed"/>
+        <w:tblLook w:firstColumn="1" w:firstRow="1" w:lastColumn="0" w:lastRow="0" w:noHBand="0" w:noVBand="1" w:val="04A0"/>
+        <w:tblBorders>
+          <w:top w:val="single" w:sz="4" w:color="BFC9D4"/>
+          <w:left w:val="single" w:sz="4" w:color="BFC9D4"/>
+          <w:bottom w:val="single" w:sz="4" w:color="BFC9D4"/>
+          <w:right w:val="single" w:sz="4" w:color="BFC9D4"/>
+          <w:insideH w:val="single" w:sz="4" w:color="BFC9D4"/>
+          <w:insideV w:val="single" w:sz="4" w:color="BFC9D4"/>
+        </w:tblBorders>
+      </w:tblPr>
+      <w:tblGrid>
+        <w:gridCol w:w="3402"/>
+        <w:gridCol w:w="6236"/>
+      </w:tblGrid>
+      <w:tr>
+        <w:trPr>
+          <w:tblHeader w:val="true"/>
+        </w:trPr>
+        <w:tc>
+          <w:tcPr>
+            <w:tcW w:type="dxa" w:w="3402"/>
+            <w:shd w:val="clear" w:color="auto" w:fill="1F3A5F"/>
+          </w:tcPr>
+          <w:p>
+            <w:pPr>
+              <w:spacing w:after="20"/>
+            </w:pPr>
+            <w:r/>
+            <w:r>
+              <w:rPr>
+                <w:b/>
+                <w:color w:val="FFFFFF"/>
+                <w:sz w:val="17"/>
+              </w:rPr>
+              <w:t>Student 4: HBase / Pig (advanced technology)</w:t>
+            </w:r>
+          </w:p>
+        </w:tc>
+        <w:tc>
+          <w:tcPr>
+            <w:tcW w:type="dxa" w:w="6236"/>
+            <w:shd w:val="clear" w:color="auto" w:fill="1F3A5F"/>
+          </w:tcPr>
+          <w:p>
+            <w:pPr>
+              <w:spacing w:after="20"/>
+            </w:pPr>
+            <w:r/>
+            <w:r>
+              <w:rPr>
+                <w:b/>
+                <w:color w:val="FFFFFF"/>
+                <w:sz w:val="17"/>
+              </w:rPr>
+            </w:r>
+          </w:p>
+        </w:tc>
+      </w:tr>
+      <w:tr>
+        <w:tc>
+          <w:tcPr>
+            <w:tcW w:type="dxa" w:w="3402"/>
+          </w:tcPr>
+          <w:p>
+            <w:pPr>
+              <w:spacing w:after="20"/>
+            </w:pPr>
+            <w:r/>
+            <w:r>
+              <w:rPr>
+                <w:b/>
+                <w:sz w:val="17"/>
+              </w:rPr>
+              <w:t>Name / roll number</w:t>
+            </w:r>
+          </w:p>
+        </w:tc>
+        <w:tc>
+          <w:tcPr>
+            <w:tcW w:type="dxa" w:w="6236"/>
+          </w:tcPr>
+          <w:p>
+            <w:pPr>
+              <w:spacing w:after="20"/>
+            </w:pPr>
+            <w:r/>
+            <w:r>
+              <w:rPr>
+                <w:sz w:val="17"/>
+              </w:rPr>
+            </w:r>
+          </w:p>
+        </w:tc>
+      </w:tr>
+      <w:tr>
+        <w:tc>
+          <w:tcPr>
+            <w:tcW w:type="dxa" w:w="3402"/>
+            <w:shd w:val="clear" w:color="auto" w:fill="F3F6FA"/>
+          </w:tcPr>
+          <w:p>
+            <w:pPr>
+              <w:spacing w:after="20"/>
+            </w:pPr>
+            <w:r/>
+            <w:r>
+              <w:rPr>
+                <w:b/>
+                <w:sz w:val="17"/>
+              </w:rPr>
+              <w:t>What I implemented</w:t>
+            </w:r>
+          </w:p>
+        </w:tc>
+        <w:tc>
+          <w:tcPr>
+            <w:tcW w:type="dxa" w:w="6236"/>
+            <w:shd w:val="clear" w:color="auto" w:fill="F3F6FA"/>
+          </w:tcPr>
+          <w:p>
+            <w:pPr>
+              <w:spacing w:after="20"/>
+            </w:pPr>
+            <w:r/>
+            <w:r>
+              <w:rPr>
+                <w:sz w:val="17"/>
+              </w:rPr>
+            </w:r>
+          </w:p>
+        </w:tc>
+      </w:tr>
+      <w:tr>
+        <w:tc>
+          <w:tcPr>
+            <w:tcW w:type="dxa" w:w="3402"/>
+          </w:tcPr>
+          <w:p>
+            <w:pPr>
+              <w:spacing w:after="20"/>
+            </w:pPr>
+            <w:r/>
+            <w:r>
+              <w:rPr>
+                <w:b/>
+                <w:sz w:val="17"/>
+              </w:rPr>
+              <w:t>Files and commits (links)</w:t>
+            </w:r>
+          </w:p>
+        </w:tc>
+        <w:tc>
+          <w:tcPr>
+            <w:tcW w:type="dxa" w:w="6236"/>
+          </w:tcPr>
+          <w:p>
+            <w:pPr>
+              <w:spacing w:after="20"/>
+            </w:pPr>
+            <w:r/>
+            <w:r>
+              <w:rPr>
+                <w:sz w:val="17"/>
+              </w:rPr>
+              <w:t xml:space="preserve">hbase/, pig/  |  commits: </w:t>
+            </w:r>
+          </w:p>
+        </w:tc>
+      </w:tr>
+      <w:tr>
+        <w:tc>
+          <w:tcPr>
+            <w:tcW w:type="dxa" w:w="3402"/>
+            <w:shd w:val="clear" w:color="auto" w:fill="F3F6FA"/>
+          </w:tcPr>
+          <w:p>
+            <w:pPr>
+              <w:spacing w:after="20"/>
+            </w:pPr>
+            <w:r/>
+            <w:r>
+              <w:rPr>
+                <w:b/>
+                <w:sz w:val="17"/>
+              </w:rPr>
+              <w:t>Commands / code I can demonstrate</w:t>
+            </w:r>
+          </w:p>
+        </w:tc>
+        <w:tc>
+          <w:tcPr>
+            <w:tcW w:type="dxa" w:w="6236"/>
+            <w:shd w:val="clear" w:color="auto" w:fill="F3F6FA"/>
+          </w:tcPr>
+          <w:p>
+            <w:pPr>
+              <w:spacing w:after="20"/>
+            </w:pPr>
+            <w:r/>
+            <w:r>
+              <w:rPr>
+                <w:sz w:val="17"/>
+              </w:rPr>
+            </w:r>
+          </w:p>
+        </w:tc>
+      </w:tr>
+      <w:tr>
+        <w:tc>
+          <w:tcPr>
+            <w:tcW w:type="dxa" w:w="3402"/>
+          </w:tcPr>
+          <w:p>
+            <w:pPr>
+              <w:spacing w:after="20"/>
+            </w:pPr>
+            <w:r/>
+            <w:r>
+              <w:rPr>
+                <w:b/>
+                <w:sz w:val="17"/>
+              </w:rPr>
+              <w:t>Technical problem I faced and how I solved it</w:t>
+            </w:r>
+          </w:p>
+        </w:tc>
+        <w:tc>
+          <w:tcPr>
+            <w:tcW w:type="dxa" w:w="6236"/>
+          </w:tcPr>
+          <w:p>
+            <w:pPr>
+              <w:spacing w:after="20"/>
+            </w:pPr>
+            <w:r/>
+            <w:r>
+              <w:rPr>
+                <w:sz w:val="17"/>
+              </w:rPr>
+            </w:r>
+          </w:p>
+        </w:tc>
+      </w:tr>
+      <w:tr>
+        <w:tc>
+          <w:tcPr>
+            <w:tcW w:type="dxa" w:w="3402"/>
+            <w:shd w:val="clear" w:color="auto" w:fill="F3F6FA"/>
+          </w:tcPr>
+          <w:p>
+            <w:pPr>
+              <w:spacing w:after="20"/>
+            </w:pPr>
+            <w:r/>
+            <w:r>
+              <w:rPr>
+                <w:b/>
+                <w:sz w:val="17"/>
+              </w:rPr>
+              <w:t>Questions I can answer</w:t>
+            </w:r>
+          </w:p>
+        </w:tc>
+        <w:tc>
+          <w:tcPr>
+            <w:tcW w:type="dxa" w:w="6236"/>
+            <w:shd w:val="clear" w:color="auto" w:fill="F3F6FA"/>
+          </w:tcPr>
+          <w:p>
+            <w:pPr>
+              <w:spacing w:after="20"/>
+            </w:pPr>
+            <w:r/>
+            <w:r>
+              <w:rPr>
+                <w:sz w:val="17"/>
+              </w:rPr>
+            </w:r>
+          </w:p>
+        </w:tc>
+      </w:tr>
+    </w:tbl>
+    <w:p>
+      <w:pPr>
+        <w:spacing w:after="40"/>
+      </w:pPr>
+    </w:p>
+    <w:tbl>
+      <w:tblPr>
+        <w:tblW w:type="auto" w:w="0"/>
+        <w:jc w:val="center"/>
+        <w:tblLayout w:type="fixed"/>
+        <w:tblLook w:firstColumn="1" w:firstRow="1" w:lastColumn="0" w:lastRow="0" w:noHBand="0" w:noVBand="1" w:val="04A0"/>
+        <w:tblBorders>
+          <w:top w:val="single" w:sz="4" w:color="BFC9D4"/>
+          <w:left w:val="single" w:sz="4" w:color="BFC9D4"/>
+          <w:bottom w:val="single" w:sz="4" w:color="BFC9D4"/>
+          <w:right w:val="single" w:sz="4" w:color="BFC9D4"/>
+          <w:insideH w:val="single" w:sz="4" w:color="BFC9D4"/>
+          <w:insideV w:val="single" w:sz="4" w:color="BFC9D4"/>
+        </w:tblBorders>
+      </w:tblPr>
+      <w:tblGrid>
+        <w:gridCol w:w="3402"/>
+        <w:gridCol w:w="6236"/>
+      </w:tblGrid>
+      <w:tr>
+        <w:trPr>
+          <w:tblHeader w:val="true"/>
+        </w:trPr>
+        <w:tc>
+          <w:tcPr>
+            <w:tcW w:type="dxa" w:w="3402"/>
+            <w:shd w:val="clear" w:color="auto" w:fill="1F3A5F"/>
+          </w:tcPr>
+          <w:p>
+            <w:pPr>
+              <w:spacing w:after="20"/>
+            </w:pPr>
+            <w:r/>
+            <w:r>
+              <w:rPr>
+                <w:b/>
+                <w:color w:val="FFFFFF"/>
+                <w:sz w:val="17"/>
+              </w:rPr>
+              <w:t>Student 5: Integration + documentation</w:t>
+            </w:r>
+          </w:p>
+        </w:tc>
+        <w:tc>
+          <w:tcPr>
+            <w:tcW w:type="dxa" w:w="6236"/>
+            <w:shd w:val="clear" w:color="auto" w:fill="1F3A5F"/>
+          </w:tcPr>
+          <w:p>
+            <w:pPr>
+              <w:spacing w:after="20"/>
+            </w:pPr>
+            <w:r/>
+            <w:r>
+              <w:rPr>
+                <w:b/>
+                <w:color w:val="FFFFFF"/>
+                <w:sz w:val="17"/>
+              </w:rPr>
+            </w:r>
+          </w:p>
+        </w:tc>
+      </w:tr>
+      <w:tr>
+        <w:tc>
+          <w:tcPr>
+            <w:tcW w:type="dxa" w:w="3402"/>
+          </w:tcPr>
+          <w:p>
+            <w:pPr>
+              <w:spacing w:after="20"/>
+            </w:pPr>
+            <w:r/>
+            <w:r>
+              <w:rPr>
+                <w:b/>
+                <w:sz w:val="17"/>
+              </w:rPr>
+              <w:t>Name / roll number</w:t>
+            </w:r>
+          </w:p>
+        </w:tc>
+        <w:tc>
+          <w:tcPr>
+            <w:tcW w:type="dxa" w:w="6236"/>
+          </w:tcPr>
+          <w:p>
+            <w:pPr>
+              <w:spacing w:after="20"/>
+            </w:pPr>
+            <w:r/>
+            <w:r>
+              <w:rPr>
+                <w:sz w:val="17"/>
+              </w:rPr>
+            </w:r>
+          </w:p>
+        </w:tc>
+      </w:tr>
+      <w:tr>
+        <w:tc>
+          <w:tcPr>
+            <w:tcW w:type="dxa" w:w="3402"/>
+            <w:shd w:val="clear" w:color="auto" w:fill="F3F6FA"/>
+          </w:tcPr>
+          <w:p>
+            <w:pPr>
+              <w:spacing w:after="20"/>
+            </w:pPr>
+            <w:r/>
+            <w:r>
+              <w:rPr>
+                <w:b/>
+                <w:sz w:val="17"/>
+              </w:rPr>
+              <w:t>What I implemented</w:t>
+            </w:r>
+          </w:p>
+        </w:tc>
+        <w:tc>
+          <w:tcPr>
+            <w:tcW w:type="dxa" w:w="6236"/>
+            <w:shd w:val="clear" w:color="auto" w:fill="F3F6FA"/>
+          </w:tcPr>
+          <w:p>
+            <w:pPr>
+              <w:spacing w:after="20"/>
+            </w:pPr>
+            <w:r/>
+            <w:r>
+              <w:rPr>
+                <w:sz w:val="17"/>
+              </w:rPr>
+            </w:r>
+          </w:p>
+        </w:tc>
+      </w:tr>
+      <w:tr>
+        <w:tc>
+          <w:tcPr>
+            <w:tcW w:type="dxa" w:w="3402"/>
+          </w:tcPr>
+          <w:p>
+            <w:pPr>
+              <w:spacing w:after="20"/>
+            </w:pPr>
+            <w:r/>
+            <w:r>
+              <w:rPr>
+                <w:b/>
+                <w:sz w:val="17"/>
+              </w:rPr>
+              <w:t>Files and commits (links)</w:t>
+            </w:r>
+          </w:p>
+        </w:tc>
+        <w:tc>
+          <w:tcPr>
+            <w:tcW w:type="dxa" w:w="6236"/>
+          </w:tcPr>
+          <w:p>
+            <w:pPr>
+              <w:spacing w:after="20"/>
+            </w:pPr>
+            <w:r/>
+            <w:r>
+              <w:rPr>
+                <w:sz w:val="17"/>
+              </w:rPr>
+              <w:t xml:space="preserve">README.md, docs/, results/  |  commits: </w:t>
+            </w:r>
+          </w:p>
+        </w:tc>
+      </w:tr>
+      <w:tr>
+        <w:tc>
+          <w:tcPr>
+            <w:tcW w:type="dxa" w:w="3402"/>
+            <w:shd w:val="clear" w:color="auto" w:fill="F3F6FA"/>
+          </w:tcPr>
+          <w:p>
+            <w:pPr>
+              <w:spacing w:after="20"/>
+            </w:pPr>
+            <w:r/>
+            <w:r>
+              <w:rPr>
+                <w:b/>
+                <w:sz w:val="17"/>
+              </w:rPr>
+              <w:t>Commands / code I can demonstrate</w:t>
+            </w:r>
+          </w:p>
+        </w:tc>
+        <w:tc>
+          <w:tcPr>
+            <w:tcW w:type="dxa" w:w="6236"/>
+            <w:shd w:val="clear" w:color="auto" w:fill="F3F6FA"/>
+          </w:tcPr>
+          <w:p>
+            <w:pPr>
+              <w:spacing w:after="20"/>
+            </w:pPr>
+            <w:r/>
+            <w:r>
+              <w:rPr>
+                <w:sz w:val="17"/>
+              </w:rPr>
+            </w:r>
+          </w:p>
+        </w:tc>
+      </w:tr>
+      <w:tr>
+        <w:tc>
+          <w:tcPr>
+            <w:tcW w:type="dxa" w:w="3402"/>
+          </w:tcPr>
+          <w:p>
+            <w:pPr>
+              <w:spacing w:after="20"/>
+            </w:pPr>
+            <w:r/>
+            <w:r>
+              <w:rPr>
+                <w:b/>
+                <w:sz w:val="17"/>
+              </w:rPr>
+              <w:t>Technical problem I faced and how I solved it</w:t>
+            </w:r>
+          </w:p>
+        </w:tc>
+        <w:tc>
+          <w:tcPr>
+            <w:tcW w:type="dxa" w:w="6236"/>
+          </w:tcPr>
+          <w:p>
+            <w:pPr>
+              <w:spacing w:after="20"/>
+            </w:pPr>
+            <w:r/>
+            <w:r>
+              <w:rPr>
+                <w:sz w:val="17"/>
+              </w:rPr>
+            </w:r>
+          </w:p>
+        </w:tc>
+      </w:tr>
+      <w:tr>
+        <w:tc>
+          <w:tcPr>
+            <w:tcW w:type="dxa" w:w="3402"/>
+            <w:shd w:val="clear" w:color="auto" w:fill="F3F6FA"/>
+          </w:tcPr>
+          <w:p>
+            <w:pPr>
+              <w:spacing w:after="20"/>
+            </w:pPr>
+            <w:r/>
+            <w:r>
+              <w:rPr>
+                <w:b/>
+                <w:sz w:val="17"/>
+              </w:rPr>
+              <w:t>Questions I can answer</w:t>
+            </w:r>
+          </w:p>
+        </w:tc>
+        <w:tc>
+          <w:tcPr>
+            <w:tcW w:type="dxa" w:w="6236"/>
+            <w:shd w:val="clear" w:color="auto" w:fill="F3F6FA"/>
+          </w:tcPr>
+          <w:p>
+            <w:pPr>
+              <w:spacing w:after="20"/>
+            </w:pPr>
+            <w:r/>
+            <w:r>
+              <w:rPr>
+                <w:sz w:val="17"/>
+              </w:rPr>
             </w:r>
           </w:p>
         </w:tc>

</xml_diff>